<commit_message>
Fill presenter details into SRS, training report and final report
- Parameterise build_srs.py / build_report.py / build_final_report.py to read
  name/UID/date from SMM_NAME / SMM_UID / SMM_DATE (kept out of source)
- Regenerate all three .docx with the cover details (Manreet Gill, 24BCS10479,
  June 2026); certificate in the final report filled too
- Supervisor name and training start/end dates left as placeholders (not provided)

Co-Authored-By: Claude Opus 4.8 <noreply@anthropic.com>
</commit_message>
<xml_diff>
--- a/docs/Final_Project_Report.docx
+++ b/docs/Final_Project_Report.docx
@@ -61,7 +61,7 @@
           <w:i w:val="0"/>
           <w:sz w:val="32"/>
         </w:rPr>
-        <w:t>[STUDENT NAME]  (UID: [__________])</w:t>
+        <w:t>Manreet Gill  (UID: 24BCS10479)</w:t>
       </w:r>
     </w:p>
     <w:p>
@@ -181,7 +181,7 @@
           <w:i w:val="0"/>
           <w:sz w:val="28"/>
         </w:rPr>
-        <w:t>[MONTH] [YEAR]</w:t>
+        <w:t>June 2026</w:t>
       </w:r>
     </w:p>
     <w:p>
@@ -211,7 +211,7 @@
         <w:jc w:val="both"/>
       </w:pPr>
       <w:r>
-        <w:t>Certified that this project report "SMART PAPER MILL PRODUCTION MONITORING DASHBOARD" is the bonafide training work of [STUDENT NAME] (UID: [__________]) who carried out the project work under my/our supervision during the industrial training from [START DATE] to [END DATE].</w:t>
+        <w:t>Certified that this project report "SMART PAPER MILL PRODUCTION MONITORING DASHBOARD" is the bonafide training work of Manreet Gill (UID: 24BCS10479) who carried out the project work under my/our supervision during the industrial training from [START DATE] to [END DATE].</w:t>
       </w:r>
     </w:p>
     <w:p/>

</xml_diff>

<commit_message>
Complete final report certificate; add internship certificate template
- Parameterise supervisor name/designation/department and training start/end
  dates in build_final_report.py (SMM_SUPERVISOR / SMM_SUP_DESIG / SMM_SUP_DEPT
  / SMM_START / SMM_END), kept out of source
- Regenerate Final_Project_Report.docx with the completed certificate
  (Mr. Surinder Mehra, IT Head - Satia Industries Ltd.; 25 May-10 July 2026)
- Add Internship_Completion_Certificate.docx (blank Satia-letterhead template)

Co-Authored-By: Claude Opus 4.8 <noreply@anthropic.com>
</commit_message>
<xml_diff>
--- a/docs/Final_Project_Report.docx
+++ b/docs/Final_Project_Report.docx
@@ -211,7 +211,7 @@
         <w:jc w:val="both"/>
       </w:pPr>
       <w:r>
-        <w:t>Certified that this project report "SMART PAPER MILL PRODUCTION MONITORING DASHBOARD" is the bonafide training work of Manreet Gill (UID: 24BCS10479) who carried out the project work under my/our supervision during the industrial training from [START DATE] to [END DATE].</w:t>
+        <w:t>Certified that this project report "SMART PAPER MILL PRODUCTION MONITORING DASHBOARD" is the bonafide training work of Manreet Gill (UID: 24BCS10479) who carried out the project work under my/our supervision during the industrial training from 25 May 2026 to 10 July 2026.</w:t>
       </w:r>
     </w:p>
     <w:p/>
@@ -258,7 +258,7 @@
           <w:i w:val="0"/>
           <w:sz w:val="24"/>
         </w:rPr>
-        <w:t>[Supervisor Name]</w:t>
+        <w:t>Mr. Surinder Mehra</w:t>
       </w:r>
     </w:p>
     <w:p>
@@ -288,7 +288,7 @@
           <w:i w:val="0"/>
           <w:sz w:val="24"/>
         </w:rPr>
-        <w:t>[Industry / Academic Designation]</w:t>
+        <w:t>IT Head, Satia Industries Ltd.</w:t>
       </w:r>
     </w:p>
     <w:p>
@@ -303,7 +303,7 @@
           <w:i w:val="0"/>
           <w:sz w:val="24"/>
         </w:rPr>
-        <w:t>[Department / Institution]</w:t>
+        <w:t>Department of CSE, Chandigarh University</w:t>
       </w:r>
     </w:p>
     <w:p>

</xml_diff>